<commit_message>
Volume 1, Chapter 3: project-setup steps (every project created by its own tools)
</commit_message>
<xml_diff>
--- a/Volume 1/Chapter 03 - File Handling/SPA_Vol1_Ch3_Lesson3_10_File_Metadata.docx
+++ b/Volume 1/Chapter 03 - File Handling/SPA_Vol1_Ch3_Lesson3_10_File_Metadata.docx
@@ -835,7 +835,7 @@
         <w:keepNext/>
       </w:pPr>
       <w:r>
-        <w:t>Save each source and supporting file from this lesson into the matching path in the project layout. As in Chapter 1, notepad .\c\basic_file_metadata.c creates and opens one: choose Yes, type the file, save it with Ctrl+S, and close Notepad. Then install the TypeScript compiler for this project.</w:t>
+        <w:t>Next, let the tools create each project's settings file, as in Chapter 1. Remember, -o names the project folder: dotnet new console -o makes a C# project there, with a .csproj file and a starter Program.cs, which you replace with this lesson's code in the C# section. Remember, go.mod makes the folder a module: go mod init writes it, and its go line shows the Go version you have installed.</w:t>
       </w:r>
     </w:p>
     <w:p>
@@ -846,9 +846,298 @@
     <w:p>
       <w:pPr>
         <w:pStyle w:val="CommandBlock"/>
-      </w:pPr>
-      <w:r>
-        <w:t>npm --prefix .\typescript install --ignore-scripts --no-audit --no-fund</w:t>
+        <w:keepNext/>
+      </w:pPr>
+      <w:r>
+        <w:t>dotnet new console -o .\csharp\BasicFileMetadata</w:t>
+      </w:r>
+    </w:p>
+    <w:p>
+      <w:pPr>
+        <w:pStyle w:val="CommandBlock"/>
+        <w:keepNext/>
+      </w:pPr>
+      <w:r>
+        <w:t>dotnet new console -o .\csharp\FileMetadata</w:t>
+      </w:r>
+    </w:p>
+    <w:p>
+      <w:pPr>
+        <w:pStyle w:val="CommandBlock"/>
+      </w:pPr>
+      <w:r>
+        <w:t>go -C .\go mod init example.com/filemetadata</w:t>
+      </w:r>
+    </w:p>
+    <w:p>
+      <w:pPr>
+        <w:keepNext/>
+      </w:pPr>
+    </w:p>
+    <w:p>
+      <w:pPr>
+        <w:keepNext/>
+      </w:pPr>
+      <w:r>
+        <w:t>Then make the TypeScript project's package.json and install its compiler. Remember, npm init -y, npm pkg, then npm install: Push-Location moves into .\typescript first, because npm init ignores --prefix, and Pop-Location moves back to lesson-3.10.</w:t>
+      </w:r>
+    </w:p>
+    <w:p>
+      <w:pPr>
+        <w:keepNext/>
+      </w:pPr>
+    </w:p>
+    <w:p>
+      <w:pPr>
+        <w:pStyle w:val="CommandBlock"/>
+        <w:keepNext/>
+      </w:pPr>
+      <w:r>
+        <w:t>Push-Location .\typescript</w:t>
+      </w:r>
+    </w:p>
+    <w:p>
+      <w:pPr>
+        <w:pStyle w:val="CommandBlock"/>
+        <w:keepNext/>
+      </w:pPr>
+      <w:r>
+        <w:t>npm init -y</w:t>
+      </w:r>
+    </w:p>
+    <w:p>
+      <w:pPr>
+        <w:pStyle w:val="CommandBlock"/>
+        <w:keepNext/>
+      </w:pPr>
+      <w:r>
+        <w:t>npm pkg set name=file-metadata-typescript type=module</w:t>
+      </w:r>
+    </w:p>
+    <w:p>
+      <w:pPr>
+        <w:pStyle w:val="CommandBlock"/>
+        <w:keepNext/>
+      </w:pPr>
+      <w:r>
+        <w:t>npm pkg set private=true --json</w:t>
+      </w:r>
+    </w:p>
+    <w:p>
+      <w:pPr>
+        <w:pStyle w:val="CommandBlock"/>
+        <w:keepNext/>
+      </w:pPr>
+      <w:r>
+        <w:t>npm pkg set "scripts.check=tsc --noEmit" "scripts.build=tsc --noEmitOnError"</w:t>
+      </w:r>
+    </w:p>
+    <w:p>
+      <w:pPr>
+        <w:pStyle w:val="CommandBlock"/>
+        <w:keepNext/>
+      </w:pPr>
+      <w:r>
+        <w:t>npm pkg delete version description main keywords author license scripts.test</w:t>
+      </w:r>
+    </w:p>
+    <w:p>
+      <w:pPr>
+        <w:pStyle w:val="CommandBlock"/>
+        <w:keepNext/>
+      </w:pPr>
+      <w:r>
+        <w:t>npm install --save-dev --save-exact typescript@7.0.2 @types/node@24.13.5 `</w:t>
+      </w:r>
+    </w:p>
+    <w:p>
+      <w:pPr>
+        <w:pStyle w:val="CommandBlock"/>
+        <w:keepNext/>
+      </w:pPr>
+      <w:r>
+        <w:t xml:space="preserve">    --ignore-scripts --no-audit --no-fund</w:t>
+      </w:r>
+    </w:p>
+    <w:p>
+      <w:pPr>
+        <w:pStyle w:val="CommandBlock"/>
+      </w:pPr>
+      <w:r>
+        <w:t>Pop-Location</w:t>
+      </w:r>
+    </w:p>
+    <w:p>
+      <w:pPr>
+        <w:keepNext/>
+      </w:pPr>
+    </w:p>
+    <w:p>
+      <w:r>
+        <w:t>Then type the TypeScript compiler settings. As in Chapter 1, notepad .\typescript\tsconfig.json creates and opens the file: choose Yes, type the file, save it with Ctrl+S, and close Notepad.</w:t>
+      </w:r>
+    </w:p>
+    <w:p>
+      <w:pPr>
+        <w:keepNext/>
+      </w:pPr>
+    </w:p>
+    <w:p>
+      <w:pPr>
+        <w:pStyle w:val="Heading3"/>
+      </w:pPr>
+      <w:r>
+        <w:t>typescript/tsconfig.json</w:t>
+      </w:r>
+    </w:p>
+    <w:p>
+      <w:pPr>
+        <w:pStyle w:val="SourceCode"/>
+        <w:keepNext/>
+      </w:pPr>
+      <w:r>
+        <w:t>{</w:t>
+      </w:r>
+    </w:p>
+    <w:p>
+      <w:pPr>
+        <w:pStyle w:val="SourceCode"/>
+        <w:keepNext/>
+      </w:pPr>
+      <w:r>
+        <w:t xml:space="preserve">  "compilerOptions": {</w:t>
+      </w:r>
+    </w:p>
+    <w:p>
+      <w:pPr>
+        <w:pStyle w:val="SourceCode"/>
+      </w:pPr>
+      <w:r>
+        <w:t xml:space="preserve">    "target": "ES2022",</w:t>
+      </w:r>
+    </w:p>
+    <w:p>
+      <w:pPr>
+        <w:pStyle w:val="SourceCode"/>
+      </w:pPr>
+      <w:r>
+        <w:t xml:space="preserve">    "module": "NodeNext",</w:t>
+      </w:r>
+    </w:p>
+    <w:p>
+      <w:pPr>
+        <w:pStyle w:val="SourceCode"/>
+      </w:pPr>
+      <w:r>
+        <w:t xml:space="preserve">    "moduleResolution": "NodeNext",</w:t>
+      </w:r>
+    </w:p>
+    <w:p>
+      <w:pPr>
+        <w:pStyle w:val="SourceCode"/>
+      </w:pPr>
+      <w:r>
+        <w:t xml:space="preserve">    "rootDir": "src",</w:t>
+      </w:r>
+    </w:p>
+    <w:p>
+      <w:pPr>
+        <w:pStyle w:val="SourceCode"/>
+      </w:pPr>
+      <w:r>
+        <w:t xml:space="preserve">    "outDir": "dist",</w:t>
+      </w:r>
+    </w:p>
+    <w:p>
+      <w:pPr>
+        <w:pStyle w:val="SourceCode"/>
+      </w:pPr>
+      <w:r>
+        <w:t xml:space="preserve">    "strict": true,</w:t>
+      </w:r>
+    </w:p>
+    <w:p>
+      <w:pPr>
+        <w:pStyle w:val="SourceCode"/>
+      </w:pPr>
+      <w:r>
+        <w:t xml:space="preserve">    "types": [</w:t>
+      </w:r>
+    </w:p>
+    <w:p>
+      <w:pPr>
+        <w:pStyle w:val="SourceCode"/>
+      </w:pPr>
+      <w:r>
+        <w:t xml:space="preserve">      "node"</w:t>
+      </w:r>
+    </w:p>
+    <w:p>
+      <w:pPr>
+        <w:pStyle w:val="SourceCode"/>
+      </w:pPr>
+      <w:r>
+        <w:t xml:space="preserve">    ],</w:t>
+      </w:r>
+    </w:p>
+    <w:p>
+      <w:pPr>
+        <w:pStyle w:val="SourceCode"/>
+      </w:pPr>
+      <w:r>
+        <w:t xml:space="preserve">    "moduleDetection": "force"</w:t>
+      </w:r>
+    </w:p>
+    <w:p>
+      <w:pPr>
+        <w:pStyle w:val="SourceCode"/>
+      </w:pPr>
+      <w:r>
+        <w:t xml:space="preserve">  },</w:t>
+      </w:r>
+    </w:p>
+    <w:p>
+      <w:pPr>
+        <w:pStyle w:val="SourceCode"/>
+      </w:pPr>
+      <w:r>
+        <w:t xml:space="preserve">  "include": [</w:t>
+      </w:r>
+    </w:p>
+    <w:p>
+      <w:pPr>
+        <w:pStyle w:val="SourceCode"/>
+        <w:keepNext/>
+      </w:pPr>
+      <w:r>
+        <w:t xml:space="preserve">    "src/**/*.ts"</w:t>
+      </w:r>
+    </w:p>
+    <w:p>
+      <w:pPr>
+        <w:pStyle w:val="SourceCode"/>
+        <w:keepNext/>
+      </w:pPr>
+      <w:r>
+        <w:t xml:space="preserve">  ]</w:t>
+      </w:r>
+    </w:p>
+    <w:p>
+      <w:pPr>
+        <w:pStyle w:val="SourceCode"/>
+      </w:pPr>
+      <w:r>
+        <w:t>}</w:t>
+      </w:r>
+    </w:p>
+    <w:p>
+      <w:pPr>
+        <w:keepNext/>
+      </w:pPr>
+    </w:p>
+    <w:p>
+      <w:r>
+        <w:t>You save each source file in its language's section below, as each is shown, the same way.</w:t>
       </w:r>
     </w:p>
     <w:p>
@@ -918,7 +1207,7 @@
         <w:keepNext/>
       </w:pPr>
       <w:r>
-        <w:t>Save each source and supporting file from this lesson into the matching path in the project layout. As in Chapter 1, nano ./c/basic_file_metadata.c creates and opens one: type the file, then save and close it with Ctrl+O, Enter, then Ctrl+X. Then install the TypeScript compiler for this project.</w:t>
+        <w:t>Then create the C#, Go, and TypeScript project files with the same commands as on Windows; cd moves into ./typescript for the npm lines, and cd .. moves back.</w:t>
       </w:r>
     </w:p>
     <w:p>
@@ -929,9 +1218,118 @@
     <w:p>
       <w:pPr>
         <w:pStyle w:val="CommandBlock"/>
-      </w:pPr>
-      <w:r>
-        <w:t>npm --prefix ./typescript install --ignore-scripts --no-audit --no-fund</w:t>
+        <w:keepNext/>
+      </w:pPr>
+      <w:r>
+        <w:t>dotnet new console -o ./csharp/BasicFileMetadata</w:t>
+      </w:r>
+    </w:p>
+    <w:p>
+      <w:pPr>
+        <w:pStyle w:val="CommandBlock"/>
+        <w:keepNext/>
+      </w:pPr>
+      <w:r>
+        <w:t>dotnet new console -o ./csharp/FileMetadata</w:t>
+      </w:r>
+    </w:p>
+    <w:p>
+      <w:pPr>
+        <w:pStyle w:val="CommandBlock"/>
+        <w:keepNext/>
+      </w:pPr>
+      <w:r>
+        <w:t>go -C ./go mod init example.com/filemetadata</w:t>
+      </w:r>
+    </w:p>
+    <w:p>
+      <w:pPr>
+        <w:pStyle w:val="CommandBlock"/>
+        <w:keepNext/>
+      </w:pPr>
+      <w:r>
+        <w:t>cd ./typescript</w:t>
+      </w:r>
+    </w:p>
+    <w:p>
+      <w:pPr>
+        <w:pStyle w:val="CommandBlock"/>
+        <w:keepNext/>
+      </w:pPr>
+      <w:r>
+        <w:t>npm init -y</w:t>
+      </w:r>
+    </w:p>
+    <w:p>
+      <w:pPr>
+        <w:pStyle w:val="CommandBlock"/>
+        <w:keepNext/>
+      </w:pPr>
+      <w:r>
+        <w:t>npm pkg set name=file-metadata-typescript type=module</w:t>
+      </w:r>
+    </w:p>
+    <w:p>
+      <w:pPr>
+        <w:pStyle w:val="CommandBlock"/>
+        <w:keepNext/>
+      </w:pPr>
+      <w:r>
+        <w:t>npm pkg set private=true --json</w:t>
+      </w:r>
+    </w:p>
+    <w:p>
+      <w:pPr>
+        <w:pStyle w:val="CommandBlock"/>
+        <w:keepNext/>
+      </w:pPr>
+      <w:r>
+        <w:t>npm pkg set "scripts.check=tsc --noEmit" "scripts.build=tsc --noEmitOnError"</w:t>
+      </w:r>
+    </w:p>
+    <w:p>
+      <w:pPr>
+        <w:pStyle w:val="CommandBlock"/>
+        <w:keepNext/>
+      </w:pPr>
+      <w:r>
+        <w:t>npm pkg delete version description main keywords author license scripts.test</w:t>
+      </w:r>
+    </w:p>
+    <w:p>
+      <w:pPr>
+        <w:pStyle w:val="CommandBlock"/>
+        <w:keepNext/>
+      </w:pPr>
+      <w:r>
+        <w:t>npm install --save-dev --save-exact typescript@7.0.2 @types/node@24.13.5 \</w:t>
+      </w:r>
+    </w:p>
+    <w:p>
+      <w:pPr>
+        <w:pStyle w:val="CommandBlock"/>
+        <w:keepNext/>
+      </w:pPr>
+      <w:r>
+        <w:t xml:space="preserve">    --ignore-scripts --no-audit --no-fund</w:t>
+      </w:r>
+    </w:p>
+    <w:p>
+      <w:pPr>
+        <w:pStyle w:val="CommandBlock"/>
+      </w:pPr>
+      <w:r>
+        <w:t>cd ..</w:t>
+      </w:r>
+    </w:p>
+    <w:p>
+      <w:pPr>
+        <w:keepNext/>
+      </w:pPr>
+    </w:p>
+    <w:p>
+      <w:r>
+        <w:t>Type typescript/tsconfig.json exactly as shown in the Windows setup. You save each source file in its language's section below, as each is shown. As in Chapter 1, nano ./c/basic_file_metadata.c creates and opens one: type the file, then save and close it with Ctrl+O, Enter, then Ctrl+X.</w:t>
       </w:r>
     </w:p>
     <w:p>
@@ -11339,7 +11737,7 @@
     </w:p>
     <w:p>
       <w:r>
-        <w:t>These files follow the same pattern as the earlier lessons: only the project names change, and go.mod names this lesson's Go module, example.com/filemetadata.</w:t>
+        <w:t>These are the files the setup commands wrote, shown here so you can check yours. Your go line shows your own Go version, and the blank lines and the order of the package.json fields may differ.</w:t>
       </w:r>
     </w:p>
     <w:p>
@@ -11677,164 +12075,6 @@
       </w:pPr>
       <w:r>
         <w:t xml:space="preserve">  }</w:t>
-      </w:r>
-    </w:p>
-    <w:p>
-      <w:pPr>
-        <w:pStyle w:val="SourceCode"/>
-      </w:pPr>
-      <w:r>
-        <w:t>}</w:t>
-      </w:r>
-    </w:p>
-    <w:p>
-      <w:pPr>
-        <w:keepNext/>
-      </w:pPr>
-    </w:p>
-    <w:p>
-      <w:pPr>
-        <w:keepNext/>
-      </w:pPr>
-    </w:p>
-    <w:p>
-      <w:pPr>
-        <w:pStyle w:val="Heading2"/>
-      </w:pPr>
-      <w:r>
-        <w:t>typescript/tsconfig.json</w:t>
-      </w:r>
-    </w:p>
-    <w:p>
-      <w:pPr>
-        <w:pStyle w:val="SourceCode"/>
-        <w:keepNext/>
-      </w:pPr>
-      <w:r>
-        <w:t>{</w:t>
-      </w:r>
-    </w:p>
-    <w:p>
-      <w:pPr>
-        <w:pStyle w:val="SourceCode"/>
-        <w:keepNext/>
-      </w:pPr>
-      <w:r>
-        <w:t xml:space="preserve">  "compilerOptions": {</w:t>
-      </w:r>
-    </w:p>
-    <w:p>
-      <w:pPr>
-        <w:pStyle w:val="SourceCode"/>
-      </w:pPr>
-      <w:r>
-        <w:t xml:space="preserve">    "target": "ES2022",</w:t>
-      </w:r>
-    </w:p>
-    <w:p>
-      <w:pPr>
-        <w:pStyle w:val="SourceCode"/>
-      </w:pPr>
-      <w:r>
-        <w:t xml:space="preserve">    "module": "NodeNext",</w:t>
-      </w:r>
-    </w:p>
-    <w:p>
-      <w:pPr>
-        <w:pStyle w:val="SourceCode"/>
-      </w:pPr>
-      <w:r>
-        <w:t xml:space="preserve">    "moduleResolution": "NodeNext",</w:t>
-      </w:r>
-    </w:p>
-    <w:p>
-      <w:pPr>
-        <w:pStyle w:val="SourceCode"/>
-      </w:pPr>
-      <w:r>
-        <w:t xml:space="preserve">    "rootDir": "src",</w:t>
-      </w:r>
-    </w:p>
-    <w:p>
-      <w:pPr>
-        <w:pStyle w:val="SourceCode"/>
-      </w:pPr>
-      <w:r>
-        <w:t xml:space="preserve">    "outDir": "dist",</w:t>
-      </w:r>
-    </w:p>
-    <w:p>
-      <w:pPr>
-        <w:pStyle w:val="SourceCode"/>
-      </w:pPr>
-      <w:r>
-        <w:t xml:space="preserve">    "strict": true,</w:t>
-      </w:r>
-    </w:p>
-    <w:p>
-      <w:pPr>
-        <w:pStyle w:val="SourceCode"/>
-      </w:pPr>
-      <w:r>
-        <w:t xml:space="preserve">    "types": [</w:t>
-      </w:r>
-    </w:p>
-    <w:p>
-      <w:pPr>
-        <w:pStyle w:val="SourceCode"/>
-      </w:pPr>
-      <w:r>
-        <w:t xml:space="preserve">      "node"</w:t>
-      </w:r>
-    </w:p>
-    <w:p>
-      <w:pPr>
-        <w:pStyle w:val="SourceCode"/>
-      </w:pPr>
-      <w:r>
-        <w:t xml:space="preserve">    ],</w:t>
-      </w:r>
-    </w:p>
-    <w:p>
-      <w:pPr>
-        <w:pStyle w:val="SourceCode"/>
-      </w:pPr>
-      <w:r>
-        <w:t xml:space="preserve">    "moduleDetection": "force"</w:t>
-      </w:r>
-    </w:p>
-    <w:p>
-      <w:pPr>
-        <w:pStyle w:val="SourceCode"/>
-      </w:pPr>
-      <w:r>
-        <w:t xml:space="preserve">  },</w:t>
-      </w:r>
-    </w:p>
-    <w:p>
-      <w:pPr>
-        <w:pStyle w:val="SourceCode"/>
-      </w:pPr>
-      <w:r>
-        <w:t xml:space="preserve">  "include": [</w:t>
-      </w:r>
-    </w:p>
-    <w:p>
-      <w:pPr>
-        <w:pStyle w:val="SourceCode"/>
-        <w:keepNext/>
-      </w:pPr>
-      <w:r>
-        <w:t xml:space="preserve">    "src/**/*.ts"</w:t>
-      </w:r>
-    </w:p>
-    <w:p>
-      <w:pPr>
-        <w:pStyle w:val="SourceCode"/>
-        <w:keepNext/>
-      </w:pPr>
-      <w:r>
-        <w:t xml:space="preserve">  ]</w:t>
       </w:r>
     </w:p>
     <w:p>
@@ -12991,31 +13231,31 @@
       </w:rPr>
     </w:lvl>
   </w:abstractNum>
-  <w:num w:numId="1" w16cid:durableId="1604454717">
+  <w:num w:numId="1" w16cid:durableId="351613691">
     <w:abstractNumId w:val="8"/>
   </w:num>
-  <w:num w:numId="2" w16cid:durableId="1738045414">
+  <w:num w:numId="2" w16cid:durableId="228614429">
     <w:abstractNumId w:val="6"/>
   </w:num>
-  <w:num w:numId="3" w16cid:durableId="201212301">
+  <w:num w:numId="3" w16cid:durableId="803934907">
     <w:abstractNumId w:val="5"/>
   </w:num>
-  <w:num w:numId="4" w16cid:durableId="781270025">
+  <w:num w:numId="4" w16cid:durableId="1161653787">
     <w:abstractNumId w:val="4"/>
   </w:num>
-  <w:num w:numId="5" w16cid:durableId="645740623">
+  <w:num w:numId="5" w16cid:durableId="1236669411">
     <w:abstractNumId w:val="7"/>
   </w:num>
-  <w:num w:numId="6" w16cid:durableId="1922909806">
+  <w:num w:numId="6" w16cid:durableId="2146584831">
     <w:abstractNumId w:val="3"/>
   </w:num>
-  <w:num w:numId="7" w16cid:durableId="1839808963">
+  <w:num w:numId="7" w16cid:durableId="76559832">
     <w:abstractNumId w:val="2"/>
   </w:num>
-  <w:num w:numId="8" w16cid:durableId="1492519907">
+  <w:num w:numId="8" w16cid:durableId="1579945105">
     <w:abstractNumId w:val="1"/>
   </w:num>
-  <w:num w:numId="9" w16cid:durableId="1150755497">
+  <w:num w:numId="9" w16cid:durableId="383413772">
     <w:abstractNumId w:val="0"/>
   </w:num>
 </w:numbering>

</xml_diff>

<commit_message>
Volume 1, Chapter 3: each language writes only to its own folder; project-setup steps
</commit_message>
<xml_diff>
--- a/Volume 1/Chapter 03 - File Handling/SPA_Vol1_Ch3_Lesson3_10_File_Metadata.docx
+++ b/Volume 1/Chapter 03 - File Handling/SPA_Vol1_Ch3_Lesson3_10_File_Metadata.docx
@@ -1352,10 +1352,7 @@
     </w:p>
     <w:p>
       <w:r>
-        <w:t>This lesson checks an exact size, so inventory.txt must hold exactly the same bytes on every computer. A text editor may save each line ending as \r\n on Windows, so write the file with one command instead. Set-Content writes text into a file (Lesson 3.3); inside double quotes, `n is PowerShell's way of writing a \n line ending, and -NoNewline stops Set-Content adding a Windows line ending of its own after the text. On Linux or macOS, printf writes the text with each \n turned into a line ending. The second</w:t>
-      </w:r>
-      <w:r>
-        <w:t xml:space="preserve"> command creates archive, an empty directory like the one Lesson 3.9 moved a finished report into; the Exercise reads its metadata.</w:t>
+        <w:t>This lesson checks an exact size, so inventory.txt must hold exactly the same bytes on every computer. A text editor may save each line ending as \r\n on Windows, so write the file with one command instead. Set-Content writes text into a file (Lesson 3.3); inside double quotes, `n is PowerShell's way of writing a \n line ending, and -NoNewline stops Set-Content adding a Windows line ending of its own after the text. On Linux or macOS, printf writes the text with each \n turned into a line ending. The second command creates archive, an empty directory like the one Lesson 3.9 moved a finished report into; the Exercise reads its metadata.</w:t>
       </w:r>
     </w:p>
     <w:p>
@@ -12421,10 +12418,7 @@
     </w:p>
     <w:p>
       <w:r>
-        <w:t>The Mini File Explorer, this chapter's first project, needs Metadata display: show the details of an entry in its sandbox. print_metadata (printMetadata, PrintMetadata) is that piece: it takes any path, whether a file or a directory, refuses a missing one with a clear Error line, and prints its name, absolute path, type, size for a file, and modification time without touching the entry. The explorer will call it for a name picked from its listing (Lesson 2.13). The Contact Manager, the chapter's capstone, m</w:t>
-      </w:r>
-      <w:r>
-        <w:t>ust keep contacts across runs; the modification time of contacts.txt shows when they were last saved. Lesson 3.11 walks a directory and everything beneath it, which the explorer needs to list a whole sandbox.</w:t>
+        <w:t>The Mini File Explorer, this chapter's first project, needs Metadata display: show the details of an entry in its sandbox. print_metadata (printMetadata, PrintMetadata) is that piece: it takes any path, whether a file or a directory, refuses a missing one with a clear Error line, and prints its name, absolute path, type, size for a file, and modification time without touching the entry. The explorer will call it for a name picked from its listing (Lesson 2.13). The Contact Manager, the chapter's capstone, must keep contacts across runs; the modification time of contacts.txt shows when they were last saved. Lesson 3.11 walks a directory and everything beneath it, which the explorer needs to list a whole sandbox.</w:t>
       </w:r>
     </w:p>
     <w:p>
@@ -13042,10 +13036,7 @@
     </w:p>
     <w:p>
       <w:r>
-        <w:t>Metadata is the data the system keeps about a file: its name, its path, its type, its size, and when its contents last changed. Each program asked the system for these facts about inventory.txt without opening it and printed them in five lines: the name, the absolute path, the type, the size in bytes with every line ending counted, and the modification time in UTC, with the path and the time checked against PowerShell's own view. The Production-Minded function takes any path, checks that it exists, reads ev</w:t>
-      </w:r>
-      <w:r>
-        <w:t>erything before printing, and shows the size only for a file, so the Mini File Explorer can show the details of whatever entry it lists. Lesson 3.11 walks a directory and everything beneath it.</w:t>
+        <w:t>Metadata is the data the system keeps about a file: its name, its path, its type, its size, and when its contents last changed. Each program asked the system for these facts about inventory.txt without opening it and printed them in five lines: the name, the absolute path, the type, the size in bytes with every line ending counted, and the modification time in UTC, with the path and the time checked against PowerShell's own view. The Production-Minded function takes any path, checks that it exists, reads everything before printing, and shows the size only for a file, so the Mini File Explorer can show the details of whatever entry it lists. Lesson 3.11 walks a directory and everything beneath it.</w:t>
       </w:r>
     </w:p>
     <w:sectPr>

</xml_diff>

<commit_message>
Volume 1, Chapter 3: updated lessons
</commit_message>
<xml_diff>
--- a/Volume 1/Chapter 03 - File Handling/SPA_Vol1_Ch3_Lesson3_10_File_Metadata.docx
+++ b/Volume 1/Chapter 03 - File Handling/SPA_Vol1_Ch3_Lesson3_10_File_Metadata.docx
@@ -544,6 +544,7 @@
         <w:pStyle w:val="CommandBlock"/>
       </w:pPr>
       <w:r>
+        <w:lastRenderedPageBreak/>
         <w:t xml:space="preserve">  csharp/BasicFileMetadata/BasicFileMetadata.csproj</w:t>
       </w:r>
     </w:p>
@@ -1352,7 +1353,10 @@
     </w:p>
     <w:p>
       <w:r>
-        <w:t>This lesson checks an exact size, so inventory.txt must hold exactly the same bytes on every computer. A text editor may save each line ending as \r\n on Windows, so write the file with one command instead. Set-Content writes text into a file (Lesson 3.3); inside double quotes, `n is PowerShell's way of writing a \n line ending, and -NoNewline stops Set-Content adding a Windows line ending of its own after the text. On Linux or macOS, printf writes the text with each \n turned into a line ending. The second command creates archive, an empty directory like the one Lesson 3.9 moved a finished report into; the Exercise reads its metadata.</w:t>
+        <w:t>This lesson checks an exact size, so inventory.txt must hold exactly the same bytes on every computer. A text editor may save each line ending as \r\n on Windows, so write the file with one command instead. Set-Content writes text into a file (Lesson 3.3); inside double quotes, `n is PowerShell's way of writing a \n line ending, and -NoNewline stops Set-Content adding a Windows line ending of its own after the text. On Linux or macOS, printf writes the text with each \n turned into a line ending. The second</w:t>
+      </w:r>
+      <w:r>
+        <w:t xml:space="preserve"> command creates archive, an empty directory like the one Lesson 3.9 moved a finished report into; the Exercise reads its metadata.</w:t>
       </w:r>
     </w:p>
     <w:p>
@@ -1988,31 +1992,31 @@
         <w:pStyle w:val="SourceCode"/>
       </w:pPr>
       <w:r>
-        <w:t xml:space="preserve">    // path on every system, so the program joins the working directory</w:t>
-      </w:r>
-    </w:p>
-    <w:p>
-      <w:pPr>
-        <w:pStyle w:val="SourceCode"/>
-      </w:pPr>
-      <w:r>
-        <w:t xml:space="preserve">    // and the name, which is what the other languages' functions do for</w:t>
-      </w:r>
-    </w:p>
-    <w:p>
-      <w:pPr>
-        <w:pStyle w:val="SourceCode"/>
-      </w:pPr>
-      <w:r>
-        <w:t xml:space="preserve">    // a name like this one. Remember, GET_WORKING_DIRECTORY writes the</w:t>
-      </w:r>
-    </w:p>
-    <w:p>
-      <w:pPr>
-        <w:pStyle w:val="SourceCode"/>
-      </w:pPr>
-      <w:r>
-        <w:t xml:space="preserve">    // working directory's full path, and snprintf never writes past sizeof.</w:t>
+        <w:t xml:space="preserve">    // path on every system, so the program joins the working directory and</w:t>
+      </w:r>
+    </w:p>
+    <w:p>
+      <w:pPr>
+        <w:pStyle w:val="SourceCode"/>
+      </w:pPr>
+      <w:r>
+        <w:t xml:space="preserve">    // the name, as the other languages do. Remember, GET_WORKING_DIRECTORY</w:t>
+      </w:r>
+    </w:p>
+    <w:p>
+      <w:pPr>
+        <w:pStyle w:val="SourceCode"/>
+      </w:pPr>
+      <w:r>
+        <w:t xml:space="preserve">    // writes the working directory's full path, and snprintf never writes</w:t>
+      </w:r>
+    </w:p>
+    <w:p>
+      <w:pPr>
+        <w:pStyle w:val="SourceCode"/>
+      </w:pPr>
+      <w:r>
+        <w:t xml:space="preserve">    // past sizeof; path is 76 bytes longer, room for SEPARATOR and the name.</w:t>
       </w:r>
     </w:p>
     <w:p>
@@ -2134,15 +2138,15 @@
         <w:pStyle w:val="SourceCode"/>
       </w:pPr>
       <w:r>
-        <w:t xml:space="preserve">    // value goes into an unsigned long long, printed with %llu. The</w:t>
-      </w:r>
-    </w:p>
-    <w:p>
-      <w:pPr>
-        <w:pStyle w:val="SourceCode"/>
-      </w:pPr>
-      <w:r>
-        <w:t xml:space="preserve">    // #define at the top makes st_size itself 64 bits.</w:t>
+        <w:t xml:space="preserve">    // value goes into an unsigned long long, a never-negative whole number,</w:t>
+      </w:r>
+    </w:p>
+    <w:p>
+      <w:pPr>
+        <w:pStyle w:val="SourceCode"/>
+      </w:pPr>
+      <w:r>
+        <w:t xml:space="preserve">    // printed with %llu. The #define at the top makes st_size itself 64 bits.</w:t>
       </w:r>
     </w:p>
     <w:p>
@@ -3962,15 +3966,15 @@
         <w:pStyle w:val="SourceCode"/>
       </w:pPr>
       <w:r>
-        <w:t xml:space="preserve">    // file_size is the file's size in bytes: every character, including</w:t>
-      </w:r>
-    </w:p>
-    <w:p>
-      <w:pPr>
-        <w:pStyle w:val="SourceCode"/>
-      </w:pPr>
-      <w:r>
-        <w:t xml:space="preserve">    // each '\n', is one byte.</w:t>
+        <w:t xml:space="preserve">    // file_size is the size in bytes; every character, '\n' too, is one byte.</w:t>
+      </w:r>
+    </w:p>
+    <w:p>
+      <w:pPr>
+        <w:pStyle w:val="SourceCode"/>
+      </w:pPr>
+      <w:r>
+        <w:t xml:space="preserve">    // std::uintmax_t, a never-negative 64-bit whole number, holds any size.</w:t>
       </w:r>
     </w:p>
     <w:p>
@@ -4857,7 +4861,7 @@
         <w:pStyle w:val="SourceCode"/>
       </w:pPr>
       <w:r>
-        <w:t xml:space="preserve">    // Remember, std::cerr is for errors only.</w:t>
+        <w:t xml:space="preserve">    // Remember, filesystem_error is a std::exception; std::cerr is for errors.</w:t>
       </w:r>
     </w:p>
     <w:p>
@@ -7963,7 +7967,7 @@
         <w:pStyle w:val="SourceCode"/>
       </w:pPr>
       <w:r>
-        <w:t xml:space="preserve">    // Remember, filepath.Abs joins the working directory and the path.</w:t>
+        <w:t xml:space="preserve">    // Remember, Abs joins the working directory and the path; := reuses err.</w:t>
       </w:r>
     </w:p>
     <w:p>
@@ -8635,7 +8639,7 @@
         <w:pStyle w:val="ListBullet"/>
       </w:pPr>
       <w:r>
-        <w:t>The Basic version throws os.Stat's error value away with _. If the file is missing, fileDetails holds no FileInfo, and the program stops with a panic, a long system message, when it calls fileDetails.Name().</w:t>
+        <w:t>The Basic version throws os.Stat's error value away with _. If the file is missing, fileDetails holds no FileInfo, and the program stops with a panic, a long system message, when it calls fileDetails.IsDir().</w:t>
       </w:r>
     </w:p>
     <w:p>
@@ -12418,7 +12422,10 @@
     </w:p>
     <w:p>
       <w:r>
-        <w:t>The Mini File Explorer, this chapter's first project, needs Metadata display: show the details of an entry in its sandbox. print_metadata (printMetadata, PrintMetadata) is that piece: it takes any path, whether a file or a directory, refuses a missing one with a clear Error line, and prints its name, absolute path, type, size for a file, and modification time without touching the entry. The explorer will call it for a name picked from its listing (Lesson 2.13). The Contact Manager, the chapter's capstone, must keep contacts across runs; the modification time of contacts.txt shows when they were last saved. Lesson 3.11 walks a directory and everything beneath it, which the explorer needs to list a whole sandbox.</w:t>
+        <w:t>The Mini File Explorer, this chapter's first project, needs Metadata display: show the details of an entry in its sandbox. print_metadata (printMetadata, PrintMetadata) is that piece: it takes any path, whether a file or a directory, refuses a missing one with a clear Error line, and prints its name, absolute path, type, size for a file, and modification time without touching the entry. The explorer will call it for a name picked from its listing (Lesson 2.13). The Contact Manager, the chapter's capstone, m</w:t>
+      </w:r>
+      <w:r>
+        <w:t>ust keep contacts across runs; the modification time of contacts.txt shows when they were last saved. Lesson 3.11 walks a directory and everything beneath it, which the explorer needs to list a whole sandbox.</w:t>
       </w:r>
     </w:p>
     <w:p>
@@ -13036,7 +13043,10 @@
     </w:p>
     <w:p>
       <w:r>
-        <w:t>Metadata is the data the system keeps about a file: its name, its path, its type, its size, and when its contents last changed. Each program asked the system for these facts about inventory.txt without opening it and printed them in five lines: the name, the absolute path, the type, the size in bytes with every line ending counted, and the modification time in UTC, with the path and the time checked against PowerShell's own view. The Production-Minded function takes any path, checks that it exists, reads everything before printing, and shows the size only for a file, so the Mini File Explorer can show the details of whatever entry it lists. Lesson 3.11 walks a directory and everything beneath it.</w:t>
+        <w:t>Metadata is the data the system keeps about a file: its name, its path, its type, its size, and when its contents last changed. Each program asked the system for these facts about inventory.txt without opening it and printed them in five lines: the name, the absolute path, the type, the size in bytes with every line ending counted, and the modification time in UTC, with the path and the time checked against PowerShell's own view. The Production-Minded function takes any path, checks that it exists, reads ev</w:t>
+      </w:r>
+      <w:r>
+        <w:t>erything before printing, and shows the size only for a file, so the Mini File Explorer can show the details of whatever entry it lists. Lesson 3.11 walks a directory and everything beneath it.</w:t>
       </w:r>
     </w:p>
     <w:sectPr>
@@ -13222,31 +13232,31 @@
       </w:rPr>
     </w:lvl>
   </w:abstractNum>
-  <w:num w:numId="1" w16cid:durableId="351613691">
+  <w:num w:numId="1" w16cid:durableId="1365867701">
     <w:abstractNumId w:val="8"/>
   </w:num>
-  <w:num w:numId="2" w16cid:durableId="228614429">
+  <w:num w:numId="2" w16cid:durableId="737167121">
     <w:abstractNumId w:val="6"/>
   </w:num>
-  <w:num w:numId="3" w16cid:durableId="803934907">
+  <w:num w:numId="3" w16cid:durableId="861361248">
     <w:abstractNumId w:val="5"/>
   </w:num>
-  <w:num w:numId="4" w16cid:durableId="1161653787">
+  <w:num w:numId="4" w16cid:durableId="1177619712">
     <w:abstractNumId w:val="4"/>
   </w:num>
-  <w:num w:numId="5" w16cid:durableId="1236669411">
+  <w:num w:numId="5" w16cid:durableId="1481119608">
     <w:abstractNumId w:val="7"/>
   </w:num>
-  <w:num w:numId="6" w16cid:durableId="2146584831">
+  <w:num w:numId="6" w16cid:durableId="76556904">
     <w:abstractNumId w:val="3"/>
   </w:num>
-  <w:num w:numId="7" w16cid:durableId="76559832">
+  <w:num w:numId="7" w16cid:durableId="487523894">
     <w:abstractNumId w:val="2"/>
   </w:num>
-  <w:num w:numId="8" w16cid:durableId="1579945105">
+  <w:num w:numId="8" w16cid:durableId="1538812063">
     <w:abstractNumId w:val="1"/>
   </w:num>
-  <w:num w:numId="9" w16cid:durableId="383413772">
+  <w:num w:numId="9" w16cid:durableId="1739085928">
     <w:abstractNumId w:val="0"/>
   </w:num>
 </w:numbering>

</xml_diff>